<commit_message>
Aula 0203 Mobile - Término Aula03 e Exercícios
</commit_message>
<xml_diff>
--- a/SENAI/WORDS/3º SEMESTRE/Mobile/Aula02_ambiente.docx
+++ b/SENAI/WORDS/3º SEMESTRE/Mobile/Aula02_ambiente.docx
@@ -179,6 +179,7 @@
       <w:r>
         <w:rPr>
           <w:rFonts w:ascii="Arial" w:hAnsi="Arial" w:cs="Arial"/>
+          <w:noProof/>
           <w:sz w:val="28"/>
           <w:szCs w:val="28"/>
         </w:rPr>
@@ -581,6 +582,7 @@
       <w:r>
         <w:rPr>
           <w:rFonts w:ascii="Arial" w:hAnsi="Arial" w:cs="Arial"/>
+          <w:noProof/>
           <w:sz w:val="28"/>
           <w:szCs w:val="28"/>
         </w:rPr>
@@ -654,6 +656,7 @@
           <w:rFonts w:ascii="Arial" w:hAnsi="Arial" w:cs="Arial"/>
           <w:b/>
           <w:bCs/>
+          <w:noProof/>
           <w:sz w:val="28"/>
           <w:szCs w:val="28"/>
         </w:rPr>
@@ -1712,16 +1715,16 @@
         <w:rPr>
           <w:rFonts w:ascii="Arial" w:hAnsi="Arial" w:cs="Arial"/>
           <w:bCs/>
-          <w:sz w:val="28"/>
-          <w:szCs w:val="28"/>
-        </w:rPr>
-      </w:pPr>
-      <w:r>
-        <w:rPr>
-          <w:rFonts w:ascii="Arial" w:hAnsi="Arial" w:cs="Arial"/>
-          <w:b/>
-          <w:sz w:val="28"/>
-          <w:szCs w:val="28"/>
+          <w:sz w:val="36"/>
+          <w:szCs w:val="36"/>
+        </w:rPr>
+      </w:pPr>
+      <w:r>
+        <w:rPr>
+          <w:rFonts w:ascii="Arial" w:hAnsi="Arial" w:cs="Arial"/>
+          <w:b/>
+          <w:sz w:val="36"/>
+          <w:szCs w:val="36"/>
         </w:rPr>
         <w:t>INICIAR</w:t>
       </w:r>
@@ -1729,12 +1732,16 @@
         <w:rPr>
           <w:rFonts w:ascii="Arial" w:hAnsi="Arial" w:cs="Arial"/>
           <w:bCs/>
-          <w:sz w:val="28"/>
-          <w:szCs w:val="28"/>
+          <w:sz w:val="36"/>
+          <w:szCs w:val="36"/>
         </w:rPr>
         <w:t xml:space="preserve"> o projeto:</w:t>
       </w:r>
       <w:r>
+        <w:rPr>
+          <w:sz w:val="32"/>
+          <w:szCs w:val="32"/>
+        </w:rPr>
         <w:t xml:space="preserve"> </w:t>
       </w:r>
       <w:proofErr w:type="spellStart"/>
@@ -1742,8 +1749,8 @@
         <w:rPr>
           <w:rFonts w:ascii="Arial" w:hAnsi="Arial" w:cs="Arial"/>
           <w:bCs/>
-          <w:sz w:val="28"/>
-          <w:szCs w:val="28"/>
+          <w:sz w:val="36"/>
+          <w:szCs w:val="36"/>
         </w:rPr>
         <w:t>npx</w:t>
       </w:r>
@@ -1752,8 +1759,8 @@
         <w:rPr>
           <w:rFonts w:ascii="Arial" w:hAnsi="Arial" w:cs="Arial"/>
           <w:bCs/>
-          <w:sz w:val="28"/>
-          <w:szCs w:val="28"/>
+          <w:sz w:val="36"/>
+          <w:szCs w:val="36"/>
         </w:rPr>
         <w:t xml:space="preserve"> expo start</w:t>
       </w:r>
@@ -3092,6 +3099,7 @@
   <w:style w:type="character" w:default="1" w:styleId="Fontepargpadro">
     <w:name w:val="Default Paragraph Font"/>
     <w:uiPriority w:val="1"/>
+    <w:semiHidden/>
     <w:unhideWhenUsed/>
   </w:style>
   <w:style w:type="table" w:default="1" w:styleId="Tabelanormal">

</xml_diff>